<commit_message>
Add author details to cover letter and title page
Co-Authored-By: Claude Sonnet 5.5 <noreply@anthropic.com>
Claude-Session: https://claude.ai/code/session_019zpN7r7iyrxAGMFgJVxuCB
</commit_message>
<xml_diff>
--- a/submission/ISR_Cover_Letter.docx
+++ b/submission/ISR_Cover_Letter.docx
@@ -101,7 +101,7 @@
           <w:sz w:val="24"/>
           <w:szCs w:val="24"/>
         </w:rPr>
-        <w:t xml:space="preserve">We submit the enclosed manuscript for consideration for publication in Information Systems Research. The manuscript asks when an organization should promote a generative AI policy that a language-model judge has scored more highly, and it treats this as an investment problem in which the instrument that licenses commitment, the judge score, can itself be noisy, gameable, and subject to change.</w:t>
+        <w:t xml:space="preserve">I submit the enclosed manuscript for consideration for publication in Information Systems Research. The manuscript asks when an organization should promote a generative AI policy that a language-model judge has scored more highly, and it treats this as an investment problem in which the instrument that licenses commitment, the judge score, can itself be noisy, gameable, and subject to change.</w:t>
       </w:r>
     </w:p>
     <w:p>
@@ -129,21 +129,21 @@
           <w:sz w:val="24"/>
           <w:szCs w:val="24"/>
         </w:rPr>
-        <w:t xml:space="preserve">We want to be clear about the scope of the evidence. The experiments are computational and use one benchmark, one policy model, and two judges, and they did not observe deliberate gaming. The stylized model’s mechanisms, including the deterrence effect of inspection, are implications of the model and have not been tested. The field study that would test the propositions in organizations is specified in the paper but has not been carried out. The manuscript is written with these limits stated explicitly.</w:t>
-      </w:r>
-    </w:p>
-    <w:p>
-      <w:pPr>
-        <w:spacing w:after="160" w:line="276"/>
-        <w:jc w:val="left"/>
-      </w:pPr>
-      <w:r>
-        <w:rPr>
-          <w:rFonts w:ascii="Times New Roman" w:cs="Times New Roman" w:eastAsia="Times New Roman" w:hAnsi="Times New Roman"/>
-          <w:sz w:val="24"/>
-          <w:szCs w:val="24"/>
-        </w:rPr>
-        <w:t xml:space="preserve">We believe the paper fits the journal’s readership interested in IT investment, IS control, and the governance of AI-enabled systems. The manuscript is anonymized for double-anonymous review, and author details are on a separate title page. An Online Appendix contains the interview protocol and codebook for the proposed field study, a derivation of the exercise rule, and the proofs.</w:t>
+        <w:t xml:space="preserve">I want to be clear about the scope of the evidence. The experiments are computational and use one benchmark, one policy model, and two judges, and they did not observe deliberate gaming. The stylized model’s mechanisms, including the deterrence effect of inspection, are implications of the model and have not been tested. The field study that would test the propositions in organizations is specified in the paper but has not been carried out. The manuscript is written with these limits stated explicitly.</w:t>
+      </w:r>
+    </w:p>
+    <w:p>
+      <w:pPr>
+        <w:spacing w:after="160" w:line="276"/>
+        <w:jc w:val="left"/>
+      </w:pPr>
+      <w:r>
+        <w:rPr>
+          <w:rFonts w:ascii="Times New Roman" w:cs="Times New Roman" w:eastAsia="Times New Roman" w:hAnsi="Times New Roman"/>
+          <w:sz w:val="24"/>
+          <w:szCs w:val="24"/>
+        </w:rPr>
+        <w:t xml:space="preserve">I believe the paper fits the journal’s readership interested in IT investment, IS control, and the governance of AI-enabled systems. The manuscript is anonymized for double-anonymous review, and my details are on a separate title page. An Online Appendix contains the interview protocol and codebook for the proposed field study, a derivation of the exercise rule, and the proofs.</w:t>
       </w:r>
     </w:p>
     <w:p>
@@ -175,7 +175,7 @@
           <w:highlight w:val="yellow"/>
           <w:highlightCs w:val="yellow"/>
         </w:rPr>
-        <w:t xml:space="preserve">[Edit to match the journal’s policy and your actual use: A generative AI assistant was used for language editing, for drafting and checking derivations and numerical scripts, and for preparing documents. The authors reviewed all content and take full responsibility for it.]</w:t>
+        <w:t xml:space="preserve">[Edit to match the journal’s policy and your actual use: A generative AI assistant was used for language editing, for drafting and checking derivations and numerical scripts, and for preparing documents. The author reviewed all content and takes full responsibility for it.]</w:t>
       </w:r>
     </w:p>
     <w:p>
@@ -205,7 +205,7 @@
           <w:sz w:val="24"/>
           <w:szCs w:val="24"/>
         </w:rPr>
-        <w:t xml:space="preserve">Thank you for considering our work.</w:t>
+        <w:t xml:space="preserve">Thank you for considering my work.</w:t>
       </w:r>
     </w:p>
     <w:p>
@@ -232,10 +232,8 @@
           <w:rFonts w:ascii="Times New Roman" w:cs="Times New Roman" w:eastAsia="Times New Roman" w:hAnsi="Times New Roman"/>
           <w:sz w:val="24"/>
           <w:szCs w:val="24"/>
-          <w:highlight w:val="yellow"/>
-          <w:highlightCs w:val="yellow"/>
-        </w:rPr>
-        <w:t xml:space="preserve">[Corresponding author name]</w:t>
+        </w:rPr>
+        <w:t xml:space="preserve">Ook Lee</w:t>
       </w:r>
     </w:p>
     <w:p>
@@ -248,10 +246,8 @@
           <w:rFonts w:ascii="Times New Roman" w:cs="Times New Roman" w:eastAsia="Times New Roman" w:hAnsi="Times New Roman"/>
           <w:sz w:val="24"/>
           <w:szCs w:val="24"/>
-          <w:highlight w:val="yellow"/>
-          <w:highlightCs w:val="yellow"/>
-        </w:rPr>
-        <w:t xml:space="preserve">[Affiliation]</w:t>
+        </w:rPr>
+        <w:t xml:space="preserve">Department of Information Systems</w:t>
       </w:r>
     </w:p>
     <w:p>
@@ -264,10 +260,36 @@
           <w:rFonts w:ascii="Times New Roman" w:cs="Times New Roman" w:eastAsia="Times New Roman" w:hAnsi="Times New Roman"/>
           <w:sz w:val="24"/>
           <w:szCs w:val="24"/>
-          <w:highlight w:val="yellow"/>
-          <w:highlightCs w:val="yellow"/>
-        </w:rPr>
-        <w:t xml:space="preserve">[Email]</w:t>
+        </w:rPr>
+        <w:t xml:space="preserve">Hanyang University</w:t>
+      </w:r>
+    </w:p>
+    <w:p>
+      <w:pPr>
+        <w:spacing w:after="0" w:line="276"/>
+        <w:jc w:val="left"/>
+      </w:pPr>
+      <w:r>
+        <w:rPr>
+          <w:rFonts w:ascii="Times New Roman" w:cs="Times New Roman" w:eastAsia="Times New Roman" w:hAnsi="Times New Roman"/>
+          <w:sz w:val="24"/>
+          <w:szCs w:val="24"/>
+        </w:rPr>
+        <w:t xml:space="preserve">Seoul, Korea</w:t>
+      </w:r>
+    </w:p>
+    <w:p>
+      <w:pPr>
+        <w:spacing w:after="0" w:line="276"/>
+        <w:jc w:val="left"/>
+      </w:pPr>
+      <w:r>
+        <w:rPr>
+          <w:rFonts w:ascii="Times New Roman" w:cs="Times New Roman" w:eastAsia="Times New Roman" w:hAnsi="Times New Roman"/>
+          <w:sz w:val="24"/>
+          <w:szCs w:val="24"/>
+        </w:rPr>
+        <w:t xml:space="preserve">ooklee@hanyang.ac.kr</w:t>
       </w:r>
     </w:p>
     <w:sectPr>

</xml_diff>